<commit_message>
Re-cut the release after the procedure tidy
Co-Authored-By: Claude Opus 5 (1M context) <noreply@anthropic.com>
</commit_message>
<xml_diff>
--- a/research/releases/2026-08-19_state_weights_plan.docx
+++ b/research/releases/2026-08-19_state_weights_plan.docx
@@ -23,7 +23,7 @@
         <w:pStyle w:val="Date"/>
       </w:pPr>
       <w:r>
-        <w:t xml:space="preserve">2026-08-19 - state-tax @ d0fe64ad4</w:t>
+        <w:t xml:space="preserve">2026-08-19 - state-tax @ e269a78a5</w:t>
       </w:r>
     </w:p>
     <w:sdt>
@@ -136,7 +136,7 @@
               <w:rPr>
                 <w:rStyle w:val="VerbatimChar"/>
               </w:rPr>
-              <w:t xml:space="preserve">d0fe64ad4</w:t>
+              <w:t xml:space="preserve">e269a78a5</w:t>
             </w:r>
           </w:p>
         </w:tc>
@@ -29515,6 +29515,147 @@
       </w:r>
     </w:p>
     <w:p>
+      <w:pPr>
+        <w:pStyle w:val="BodyText"/>
+      </w:pPr>
+      <w:r>
+        <w:rPr>
+          <w:b/>
+          <w:bCs/>
+        </w:rPr>
+        <w:t xml:space="preserve">Step numbers in the body are that document’s</w:t>
+      </w:r>
+      <w:r>
+        <w:t xml:space="preserve">, not the plan’s task letters. The</w:t>
+      </w:r>
+      <w:r>
+        <w:t xml:space="preserve"> </w:t>
+      </w:r>
+      <w:r>
+        <w:t xml:space="preserve">mapping is one-to-one: step 1 →</w:t>
+      </w:r>
+      <w:r>
+        <w:t xml:space="preserve"> </w:t>
+      </w:r>
+      <w:r>
+        <w:rPr>
+          <w:b/>
+          <w:bCs/>
+        </w:rPr>
+        <w:t xml:space="preserve">C</w:t>
+      </w:r>
+      <w:r>
+        <w:t xml:space="preserve"> </w:t>
+      </w:r>
+      <w:r>
+        <w:t xml:space="preserve">(filing model on the ASEC), step 2 →</w:t>
+      </w:r>
+      <w:r>
+        <w:t xml:space="preserve"> </w:t>
+      </w:r>
+      <w:r>
+        <w:rPr>
+          <w:b/>
+          <w:bCs/>
+        </w:rPr>
+        <w:t xml:space="preserve">B</w:t>
+      </w:r>
+      <w:r>
+        <w:t xml:space="preserve"> </w:t>
+      </w:r>
+      <w:r>
+        <w:t xml:space="preserve">(group quarters), step 3 →</w:t>
+      </w:r>
+      <w:r>
+        <w:t xml:space="preserve"> </w:t>
+      </w:r>
+      <w:r>
+        <w:rPr>
+          <w:b/>
+          <w:bCs/>
+        </w:rPr>
+        <w:t xml:space="preserve">D</w:t>
+      </w:r>
+      <w:r>
+        <w:t xml:space="preserve"> </w:t>
+      </w:r>
+      <w:r>
+        <w:t xml:space="preserve">(Tax-Data rework, so</w:t>
+      </w:r>
+      <w:r>
+        <w:t xml:space="preserve"> </w:t>
+      </w:r>
+      <w:r>
+        <w:t xml:space="preserve">“step 3a”</w:t>
+      </w:r>
+      <w:r>
+        <w:t xml:space="preserve"> </w:t>
+      </w:r>
+      <w:r>
+        <w:t xml:space="preserve">is D1, the age fix),</w:t>
+      </w:r>
+      <w:r>
+        <w:t xml:space="preserve"> </w:t>
+      </w:r>
+      <w:r>
+        <w:t xml:space="preserve">step 4 →</w:t>
+      </w:r>
+      <w:r>
+        <w:t xml:space="preserve"> </w:t>
+      </w:r>
+      <w:r>
+        <w:rPr>
+          <w:b/>
+          <w:bCs/>
+        </w:rPr>
+        <w:t xml:space="preserve">E</w:t>
+      </w:r>
+      <w:r>
+        <w:t xml:space="preserve"> </w:t>
+      </w:r>
+      <w:r>
+        <w:t xml:space="preserve">(this document), step 5 →</w:t>
+      </w:r>
+      <w:r>
+        <w:t xml:space="preserve"> </w:t>
+      </w:r>
+      <w:r>
+        <w:rPr>
+          <w:b/>
+          <w:bCs/>
+        </w:rPr>
+        <w:t xml:space="preserve">F</w:t>
+      </w:r>
+      <w:r>
+        <w:t xml:space="preserve"> </w:t>
+      </w:r>
+      <w:r>
+        <w:t xml:space="preserve">(state-weights margins and re-fit),</w:t>
+      </w:r>
+      <w:r>
+        <w:t xml:space="preserve"> </w:t>
+      </w:r>
+      <w:r>
+        <w:t xml:space="preserve">step 6 →</w:t>
+      </w:r>
+      <w:r>
+        <w:t xml:space="preserve"> </w:t>
+      </w:r>
+      <w:r>
+        <w:rPr>
+          <w:b/>
+          <w:bCs/>
+        </w:rPr>
+        <w:t xml:space="preserve">G</w:t>
+      </w:r>
+      <w:r>
+        <w:t xml:space="preserve"> </w:t>
+      </w:r>
+      <w:r>
+        <w:t xml:space="preserve">(swap-in).</w:t>
+      </w:r>
+    </w:p>
+    <w:p>
       <w:r>
         <w:pict>
           <v:rect style="width:0;height:1.5pt" o:hralign="center" o:hrstd="t" o:hr="t"/>
@@ -39043,13 +39184,6 @@
         </w:pict>
       </w:r>
     </w:p>
-    <w:p>
-      <w:r>
-        <w:pict>
-          <v:rect style="width:0;height:1.5pt" o:hralign="center" o:hrstd="t" o:hr="t"/>
-        </w:pict>
-      </w:r>
-    </w:p>
     <w:bookmarkEnd w:id="83"/>
     <w:bookmarkStart w:id="84" w:name="end-to-end-verification"/>
     <w:p>
@@ -39065,27 +39199,13 @@
         <w:pStyle w:val="FirstParagraph"/>
       </w:pPr>
       <w:r>
-        <w:t xml:space="preserve">The federal battery above is the acceptance gate. These are the state-side and</w:t>
-      </w:r>
-      <w:r>
-        <w:t xml:space="preserve"> </w:t>
-      </w:r>
-      <w:r>
-        <w:t xml:space="preserve">end-to-end checks that follow it.</w:t>
-      </w:r>
-    </w:p>
-    <w:p>
-      <w:pPr>
-        <w:pStyle w:val="BodyText"/>
-      </w:pPr>
-      <w:r>
-        <w:t xml:space="preserve">The federal battery is step 4 (its 4a table is the acceptance gate). State-side and</w:t>
-      </w:r>
-      <w:r>
-        <w:t xml:space="preserve"> </w:t>
-      </w:r>
-      <w:r>
-        <w:t xml:space="preserve">end-to-end checks:</w:t>
+        <w:t xml:space="preserve">The federal battery above is the acceptance gate — its 4a table is the bar. These</w:t>
+      </w:r>
+      <w:r>
+        <w:t xml:space="preserve"> </w:t>
+      </w:r>
+      <w:r>
+        <w:t xml:space="preserve">are the state-side and end-to-end checks that follow it.</w:t>
       </w:r>
     </w:p>
     <w:p>

</xml_diff>